<commit_message>
docs: synchronize GDD and TDD before M2
</commit_message>
<xml_diff>
--- a/Docs/Chennai_Sixes_Auction_GDD_v0.2.docx
+++ b/Docs/Chennai_Sixes_Auction_GDD_v0.2.docx
@@ -290,6 +290,78 @@
       </w:pPr>
       <w:r>
         <w:t>Those 25 cards are shuffled before Round 1.</w:t>
+      </w:r>
+    </w:p>
+    <w:p>
+      <w:pPr>
+        <w:pStyle w:val="Heading2"/>
+      </w:pPr>
+      <w:r>
+        <w:t>3.1 M2 Data Contract</w:t>
+      </w:r>
+    </w:p>
+    <w:p>
+      <w:pPr>
+        <w:pStyle w:val="ListBullet"/>
+      </w:pPr>
+      <w:r>
+        <w:t>The initial M2 catalog contains exactly 50 fictional NORMAL players. Punishment players are maintained in a separate dataset and are not part of the normal M2 catalog.</w:t>
+      </w:r>
+    </w:p>
+    <w:p>
+      <w:pPr>
+        <w:pStyle w:val="ListBullet"/>
+      </w:pPr>
+      <w:r>
+        <w:t>The exported normal catalog is treated as the eligible catalog for M2. No separate eligibility system is introduced at this milestone.</w:t>
+      </w:r>
+    </w:p>
+    <w:p>
+      <w:pPr>
+        <w:pStyle w:val="ListBullet"/>
+      </w:pPr>
+      <w:r>
+        <w:t>Every normal player has a stable unique player ID. BAT, BOWL, WK and LEAD are stored as integers from 0 to 100.</w:t>
+      </w:r>
+    </w:p>
+    <w:p>
+      <w:pPr>
+        <w:pStyle w:val="ListBullet"/>
+      </w:pPr>
+      <w:r>
+        <w:t>Overall is stored/authored for M2; its final derivation and balancing formula remains TBD.</w:t>
+      </w:r>
+    </w:p>
+    <w:p>
+      <w:pPr>
+        <w:pStyle w:val="ListBullet"/>
+      </w:pPr>
+      <w:r>
+        <w:t>Base price is stored as a non-negative integer money unit; final economy and balance values remain provisional.</w:t>
+      </w:r>
+    </w:p>
+    <w:p>
+      <w:pPr>
+        <w:pStyle w:val="ListBullet"/>
+      </w:pPr>
+      <w:r>
+        <w:t>A normal player may include an optional imageRef for future player artwork.</w:t>
+      </w:r>
+    </w:p>
+    <w:p>
+      <w:pPr>
+        <w:pStyle w:val="ListBullet"/>
+      </w:pPr>
+      <w:r>
+        <w:t>M2 uses deterministic seeded randomness with a documented stable PRNG implementation and a non-mutating Fisher-Yates shuffle.</w:t>
+      </w:r>
+    </w:p>
+    <w:p>
+      <w:pPr>
+        <w:pStyle w:val="ListBullet"/>
+      </w:pPr>
+      <w:r>
+        <w:t>The public selected 25 and the private shuffled auction queue are separate values so future player order cannot leak accidentally.</w:t>
       </w:r>
     </w:p>
     <w:p>
@@ -618,7 +690,7 @@
       </w:pPr>
       <w:r>
         <w:rPr/>
-        <w:t>Timeout is treated as NOT INTERESTED for that card.</w:t>
+        <w:t>A 10-second timeout is treated as PASS. It skips only the current turn, and the team remains eligible if bidding cycles back.</w:t>
       </w:r>
     </w:p>
     <w:p>
@@ -662,7 +734,7 @@
       </w:pPr>
       <w:r>
         <w:rPr/>
-        <w:t>If every eligible team passes, exits, times out, or becomes ineligible before any bid exists, the card is UNSOLD. In Round 1 it enters the Unsold Pool; in Round 2 it leaves the auction.</w:t>
+        <w:t>If every eligible team passes (including by timeout), explicitly chooses NOT INTERESTED, or becomes ineligible before any bid exists, the card is UNSOLD. In Round 1 it enters the Unsold Pool; in Round 2 it leaves the auction.</w:t>
       </w:r>
     </w:p>
     <w:p>
@@ -855,7 +927,7 @@
       </w:pPr>
       <w:r>
         <w:rPr/>
-        <w:t>A player receiving no bid after every eligible team passes/exits/times out becomes UNSOLD and enters the Unsold Pool.</w:t>
+        <w:t>A player receiving no bid after every eligible team passes (including by timeout), explicitly chooses NOT INTERESTED, or becomes ineligible becomes UNSOLD and enters the Unsold Pool.</w:t>
       </w:r>
     </w:p>
     <w:p>
@@ -912,7 +984,7 @@
       </w:pPr>
       <w:r>
         <w:rPr/>
-        <w:t>If a Round 2 card again receives no bid after all eligible teams pass/exit/time out, it leaves the auction permanently.</w:t>
+        <w:t>If a Round 2 card again receives no bid after all eligible teams pass (including by timeout), explicitly choose NOT INTERESTED, or become ineligible, it leaves the auction permanently.</w:t>
       </w:r>
     </w:p>
     <w:p>
@@ -974,6 +1046,14 @@
       </w:pPr>
       <w:r>
         <w:t>Punishment players are deliberately awful, funny fictional characters: unfit retirees, absurd amateurs, school-level players, etc.</w:t>
+      </w:r>
+    </w:p>
+    <w:p>
+      <w:pPr>
+        <w:pStyle w:val="ListBullet"/>
+      </w:pPr>
+      <w:r>
+        <w:t>Punishment players come from their own dataset and are never included in the 50-player normal catalog or the random 25-player draw.</w:t>
       </w:r>
     </w:p>
     <w:p>
@@ -1314,7 +1394,7 @@
     </w:p>
     <w:p>
       <w:r>
-        <w:t>V1 uses three AI opponents. AI must obey the same rules and information boundaries as the human and must not know the hidden shuffled order.</w:t>
+        <w:t>V1 uses three AI opponents. AI must obey the same rules and information boundaries as the human, must not know the hidden shuffled order, and must support all three auction actions: BID, PASS and NOT_INTERESTED.</w:t>
       </w:r>
     </w:p>
     <w:p>
@@ -1566,6 +1646,14 @@
       </w:pPr>
       <w:r>
         <w:t>PASS is temporary: show PASSED briefly, then the team can become active again on a later rotation.</w:t>
+      </w:r>
+    </w:p>
+    <w:p>
+      <w:pPr>
+        <w:pStyle w:val="ListBullet"/>
+      </w:pPr>
+      <w:r>
+        <w:t>A timeout uses the same temporary PASS state; it does not mark the team NOT INTERESTED.</w:t>
       </w:r>
     </w:p>
     <w:p>
@@ -1750,6 +1838,12 @@
         <w:br/>
         <w:br/>
         <w:t xml:space="preserve">             [ START AUCTION ]</w:t>
+      </w:r>
+    </w:p>
+    <w:p>
+      <w:pPr/>
+      <w:r>
+        <w:t>Mockup currency note: "INR 3 CRORE EACH" is example copy only. The starting purse and currency scale remain TBD until formally locked; implemented copy must use the configured values.</w:t>
       </w:r>
     </w:p>
     <w:p>
@@ -1874,32 +1968,32 @@
           <w:rFonts w:ascii="Courier New" w:hAnsi="Courier New" w:eastAsia="Courier New"/>
           <w:sz w:val="15"/>
         </w:rPr>
-        <w:t>Same live-auction layout; only the active seat changes.</w:t>
+        <w:t>Same live-auction layout; only the active seat changes.             +---------------------------+             | MARINA MAVERICKS       AI |             | Players 5   Balance 82L   |             | BAT/BOWL/WK/LEAD/Overall  |             |                           |             |      DECIDING... 06s      |             +---------------------------+BOTTOM: CURRENT BID 25L - MARINA IS DECIDING...        Bid / PASS / NOT INTERESTED controls disabled.PASS -&gt; brief PASSED state; team remains eligible next rotation.NI   -&gt; persistent NOT INTERESTED state; team is skipped for this card.TIMEOUT -&gt; PASS; the team remains eligible if bidding cycles back.</w:t>
         <w:br/>
         <w:br/>
-        <w:t xml:space="preserve">             +---------------------------+</w:t>
+        <w:t xml:space="preserve"/>
         <w:br/>
-        <w:t xml:space="preserve">             | MARINA MAVERICKS       AI |</w:t>
+        <w:t xml:space="preserve"/>
         <w:br/>
-        <w:t xml:space="preserve">             | Players 5   Balance 82L   |</w:t>
+        <w:t xml:space="preserve"/>
         <w:br/>
-        <w:t xml:space="preserve">             | BAT/BOWL/WK/LEAD/Overall  |</w:t>
+        <w:t xml:space="preserve"/>
         <w:br/>
-        <w:t xml:space="preserve">             |                           |</w:t>
+        <w:t xml:space="preserve"/>
         <w:br/>
-        <w:t xml:space="preserve">             |      DECIDING... 06s      |</w:t>
+        <w:t xml:space="preserve"/>
         <w:br/>
-        <w:t xml:space="preserve">             +---------------------------+</w:t>
+        <w:t xml:space="preserve"/>
         <w:br/>
         <w:br/>
-        <w:t>BOTTOM: CURRENT BID 25L - MARINA IS DECIDING...</w:t>
+        <w:t/>
         <w:br/>
-        <w:t xml:space="preserve">        Bid / PASS / NOT INTERESTED controls disabled.</w:t>
+        <w:t xml:space="preserve"/>
         <w:br/>
         <w:br/>
-        <w:t>PASS -&gt; brief PASSED state; team remains eligible next rotation.</w:t>
+        <w:t/>
         <w:br/>
-        <w:t>NI   -&gt; persistent NOT INTERESTED state; team is skipped for this card.</w:t>
+        <w:t/>
       </w:r>
     </w:p>
     <w:p>
@@ -2339,7 +2433,7 @@
         <w:pStyle w:val="ListBullet"/>
       </w:pPr>
       <w:r>
-        <w:t>Master database size at launch.</w:t>
+        <w:t>Catalog expansion beyond the initial 50-player M2 dataset.</w:t>
       </w:r>
     </w:p>
     <w:p>

</xml_diff>

<commit_message>
sixes: implement M9 AI bidders
</commit_message>
<xml_diff>
--- a/Docs/Chennai_Sixes_Auction_GDD_v0.2.docx
+++ b/Docs/Chennai_Sixes_Auction_GDD_v0.2.docx
@@ -1418,7 +1418,7 @@
         <w:pStyle w:val="ListBullet"/>
       </w:pPr>
       <w:r>
-        <w:t>AI should react to its own live squad strengths, remaining purse, the known 25-player pool, rivals' public weaknesses and current bidding.</w:t>
+        <w:t xml:space="preserve">AI reacts only to the current player, public ratings/base price, current bid and leader, its own purse/squad/Best Six strength, opponents' public purses/squads/strengths, round, and public auction progress. It never receives the selected pool as future-player input, either private queue, another AI's tendencies, or seed data for prediction.</w:t>
       </w:r>
     </w:p>
     <w:p>
@@ -1434,7 +1434,7 @@
         <w:pStyle w:val="ListBullet"/>
       </w:pPr>
       <w:r>
-        <w:t>Exact AI weights are TBD and should be tuned through automated simulations plus human playtesting.</w:t>
+        <w:t xml:space="preserve">M9 uses centralized, tunable heuristic weights for rating quality, marginal Best Six improvement, weakness repair, squad completion pressure, purse sensitivity, round, rival pressure and per-game personality. Exact balance remains intentionally provisional for M15 simulation and human playtesting.</w:t>
       </w:r>
     </w:p>
     <w:p>
@@ -1669,7 +1669,7 @@
         <w:pStyle w:val="ListBullet"/>
       </w:pPr>
       <w:r>
-        <w:t>AI uses the same turn presentation but may act after a short randomized delay rather than deliberately consuming all 10 seconds.</w:t>
+        <w:t xml:space="preserve">AI uses the same turn presentation but normally acts after a short presentation-only delay rather than deliberately consuming all 10 seconds. The authoritative timer remains active.</w:t>
       </w:r>
     </w:p>
     <w:p>
@@ -1971,29 +1971,40 @@
         <w:t>Same live-auction layout; only the active seat changes.             +---------------------------+             | MARINA MAVERICKS       AI |             | Players 5   Balance 82L   |             | BAT/BOWL/WK/LEAD/Overall  |             |                           |             |      DECIDING... 06s      |             +---------------------------+BOTTOM: CURRENT BID 25L - MARINA IS DECIDING...        Bid / PASS / NOT INTERESTED controls disabled.PASS -&gt; brief PASSED state; team remains eligible next rotation.NI   -&gt; persistent NOT INTERESTED state; team is skipped for this card.TIMEOUT -&gt; PASS; the team remains eligible if bidding cycles back.</w:t>
         <w:br/>
         <w:br/>
-        <w:t xml:space="preserve"/>
+        <w:t xml:space="preserve">
+        </w:t>
         <w:br/>
-        <w:t xml:space="preserve"/>
+        <w:t xml:space="preserve">
+        </w:t>
         <w:br/>
-        <w:t xml:space="preserve"/>
+        <w:t xml:space="preserve">
+        </w:t>
         <w:br/>
-        <w:t xml:space="preserve"/>
+        <w:t xml:space="preserve">
+        </w:t>
         <w:br/>
-        <w:t xml:space="preserve"/>
+        <w:t xml:space="preserve">
+        </w:t>
         <w:br/>
-        <w:t xml:space="preserve"/>
+        <w:t xml:space="preserve">
+        </w:t>
         <w:br/>
-        <w:t xml:space="preserve"/>
+        <w:t xml:space="preserve">
+        </w:t>
         <w:br/>
         <w:br/>
-        <w:t/>
+        <w:t>
+        </w:t>
         <w:br/>
-        <w:t xml:space="preserve"/>
+        <w:t xml:space="preserve">
+        </w:t>
         <w:br/>
         <w:br/>
-        <w:t/>
+        <w:t>
+        </w:t>
         <w:br/>
-        <w:t/>
+        <w:t>
+        </w:t>
       </w:r>
     </w:p>
     <w:p>

</xml_diff>

<commit_message>
sixes: implement M10 emergency signings
</commit_message>
<xml_diff>
--- a/Docs/Chennai_Sixes_Auction_GDD_v0.2.docx
+++ b/Docs/Chennai_Sixes_Auction_GDD_v0.2.docx
@@ -1029,7 +1029,7 @@
         <w:pStyle w:val="ListBullet"/>
       </w:pPr>
       <w:r>
-        <w:t>After the auction ends, any team with fewer than six normal players is automatically filled to six with free punishment players.</w:t>
+        <w:t>After Round 2 ends (or after Round 1 when no Round 2 is needed), every team below six normal purchases is automatically filled to exactly six available players with free emergency/punishment assignments. Teams with six or more normal purchases receive none; teams above six keep every normal player.</w:t>
       </w:r>
     </w:p>
     <w:p>
@@ -1037,7 +1037,7 @@
         <w:pStyle w:val="ListBullet"/>
       </w:pPr>
       <w:r>
-        <w:t>Punishment players cost nothing because money no longer matters after the auction.</w:t>
+        <w:t>Punishment players cost INR 0, never alter the remaining purse, never trigger bank rules, and are not BID/SOLD purchases or Round 1/Round 2 sales.</w:t>
       </w:r>
     </w:p>
     <w:p>
@@ -1045,7 +1045,7 @@
         <w:pStyle w:val="ListBullet"/>
       </w:pPr>
       <w:r>
-        <w:t>Punishment players are deliberately awful, funny fictional characters: unfit retirees, absurd amateurs, school-level players, etc.</w:t>
+        <w:t>Punishment players are deliberately weak fictional characters whose comedy comes from absurd unsuitability rather than stereotypes; their ratings vary but are substantially below normal auction talent.</w:t>
       </w:r>
     </w:p>
     <w:p>
@@ -1053,7 +1053,7 @@
         <w:pStyle w:val="ListBullet"/>
       </w:pPr>
       <w:r>
-        <w:t>Punishment players come from their own dataset and are never included in the 50-player normal catalog or the random 25-player draw.</w:t>
+        <w:t>M10 provides 28 unique punishment players in a standalone catalog. They are never included in the 50-player normal catalog, the random 25-player draw, or either auction round, and no player can be assigned twice in one game.</w:t>
       </w:r>
     </w:p>
     <w:p>
@@ -1061,7 +1061,7 @@
         <w:pStyle w:val="ListBullet"/>
       </w:pPr>
       <w:r>
-        <w:t>Punishment players are worse than merely weak normal players. Receiving them is a consequence of failing to assemble six usable cricketers.</w:t>
+        <w:t>Assignments use a domain-separated deterministic seeded shuffle: the same game seed and auction outcome reproduce the same assignments, while the future emergency order remains hidden until completion.</w:t>
       </w:r>
     </w:p>
     <w:p>
@@ -1543,7 +1543,7 @@
         <w:pStyle w:val="ListBullet"/>
       </w:pPr>
       <w:r>
-        <w:t>Punishment-player reveal should be comedic and painful, not a dry auto-fill message.</w:t>
+        <w:t>The M10 harness shows an Emergency Signings event with each affected team, assigned names and ratings; squad rows mark emergency players as EMERGENCY and FREE while preserving automatic BEST SIX badges.</w:t>
       </w:r>
     </w:p>
     <w:p>

</xml_diff>

<commit_message>
sixes: implement M12 league and final
</commit_message>
<xml_diff>
--- a/Docs/Chennai_Sixes_Auction_GDD_v0.2.docx
+++ b/Docs/Chennai_Sixes_Auction_GDD_v0.2.docx
@@ -1280,7 +1280,7 @@
         <w:pStyle w:val="ListBullet"/>
       </w:pPr>
       <w:r>
-        <w:t>Winner of the final is champion.</w:t>
+        <w:t>Winner of the final is champion; the loser is runner-up. M12 runs the complete tournament automatically after auction completion.</w:t>
       </w:r>
     </w:p>
     <w:p>
@@ -1304,7 +1304,7 @@
         <w:pStyle w:val="ListBullet"/>
       </w:pPr>
       <w:r>
-        <w:t>A mathematically exact final tie fallback is TBD.</w:t>
+        <w:t>If points and Overall are tied, standings compare BAT, then BOWL, WK and LEAD; a remaining exact tie uses deterministic seat order and team ID.</w:t>
       </w:r>
     </w:p>
     <w:p>
@@ -1543,7 +1543,7 @@
         <w:pStyle w:val="ListBullet"/>
       </w:pPr>
       <w:r>
-        <w:t>The M10 harness shows an Emergency Signings event with each affected team, assigned names and ratings; squad rows mark emergency players as EMERGENCY and FREE while preserving automatic BEST SIX badges. M11 adds a post-auction development match tester with two team selectors, one SIMULATE MATCH action, both innings totals, overs, winner, and correct run/wicket/tiebreak margin. It does not add league or cricket controls.</w:t>
+        <w:t>The M10 harness shows Emergency Signings and preserves automatic BEST SIX badges. M11 supplied the post-auction match tester and authoritative compact match result. M12 replaces that tester with an automatic six-match league, deterministic standings, one top-two final, champion display, and PLAY AGAIN path; there are no post-auction cricket controls.</w:t>
       </w:r>
     </w:p>
     <w:p>

</xml_diff>